<commit_message>
feat(pricing): update pricing plans to Free vs Pro with monthly 99 and yearly 999; add FormInvitation collaborative feature
</commit_message>
<xml_diff>
--- a/PromptForm_AI_Final_Project_Report.docx
+++ b/PromptForm_AI_Final_Project_Report.docx
@@ -2943,7 +2943,7 @@
           <w:sz w:val="24"/>
           <w:szCs w:val="24"/>
         </w:rPr>
-        <w:t xml:space="preserve">Figure 6.4: Major Interface / UI Design (Interactive Builder &amp; Live Renderer)</w:t>
+        <w:t xml:space="preserve">Figure 6.4: Major Interface / UI Design (Interactive Builder &amp; Live Renderer Screenshots)</w:t>
       </w:r>
     </w:p>
     <w:p>
@@ -2981,7 +2981,7 @@
           <w:sz w:val="24"/>
           <w:szCs w:val="24"/>
         </w:rPr>
-        <w:t xml:space="preserve">Figure 8.2: Module 2 Implementation / Output — Interactive Drag &amp; Drop Editor</w:t>
+        <w:t xml:space="preserve">Figure 8.2: Module 2 Implementation / Output — Interactive Drag &amp; Drop Editor Canvas</w:t>
       </w:r>
     </w:p>
     <w:p>
@@ -3038,7 +3038,7 @@
           <w:sz w:val="24"/>
           <w:szCs w:val="24"/>
         </w:rPr>
-        <w:t xml:space="preserve">Figure 10.2: Final Output Screenshot 2 — Generated Form Preview &amp; Edit View</w:t>
+        <w:t xml:space="preserve">Figure 10.2: Final Output Screenshot 2 — Interactive Builder &amp; Live Preview View</w:t>
       </w:r>
     </w:p>
     <w:p>
@@ -3057,7 +3057,7 @@
           <w:sz w:val="24"/>
           <w:szCs w:val="24"/>
         </w:rPr>
-        <w:t xml:space="preserve">Figure 10.3: Final Output Screenshot 3 — Public Responder View &amp; Anti-Cheat System</w:t>
+        <w:t xml:space="preserve">Figure 10.3: Final Output Screenshot 3 — User Authentication &amp; Session Security</w:t>
       </w:r>
     </w:p>
     <w:p>
@@ -3076,7 +3076,7 @@
           <w:sz w:val="24"/>
           <w:szCs w:val="24"/>
         </w:rPr>
-        <w:t xml:space="preserve">Figure 10.4: Final Output Screenshot 4 — Response CSV Export &amp; Analytics View</w:t>
+        <w:t xml:space="preserve">Figure 10.4: Final Output Screenshot 4 — Form Templates Gallery &amp; Subscription Pricing</w:t>
       </w:r>
     </w:p>
     <w:p>
@@ -15514,65 +15514,258 @@
         <w:t xml:space="preserve">6.8 Interface / UI Design</w:t>
       </w:r>
     </w:p>
-    <w:tbl>
-      <w:tblPr>
-        <w:tblW w:type="pct" w:w="5000"/>
-        <w:tblBorders>
-          <w:top w:val="single" w:color="auto" w:sz="4"/>
-          <w:left w:val="single" w:color="auto" w:sz="4"/>
-          <w:bottom w:val="single" w:color="auto" w:sz="4"/>
-          <w:right w:val="single" w:color="auto" w:sz="4"/>
-          <w:insideH w:val="single" w:color="auto" w:sz="4"/>
-          <w:insideV w:val="single" w:color="auto" w:sz="4"/>
-        </w:tblBorders>
-      </w:tblPr>
-      <w:tblGrid>
-        <w:gridCol w:w="9026"/>
-      </w:tblGrid>
-      <w:tr>
-        <w:tc>
-          <w:tcPr>
-            <w:tcBorders>
-              <w:top w:val="none"/>
-              <w:left w:val="single" w:color="2563EB" w:sz="24"/>
-              <w:bottom w:val="none"/>
-              <w:right w:val="none"/>
-            </w:tcBorders>
-            <w:shd w:fill="F0F9FF" w:val="clear"/>
-            <w:tcMar>
-              <w:top w:type="dxa" w:w="140"/>
-              <w:left w:type="dxa" w:w="200"/>
-              <w:bottom w:type="dxa" w:w="140"/>
-              <w:right w:type="dxa" w:w="200"/>
-            </w:tcMar>
-          </w:tcPr>
-          <w:p>
-            <w:pPr>
-              <w:spacing w:after="60" w:before="40"/>
-            </w:pPr>
-            <w:r>
-              <w:rPr>
-                <w:rFonts w:ascii="Cambria" w:cs="Cambria" w:eastAsia="Cambria" w:hAnsi="Cambria"/>
-                <w:b/>
-                <w:bCs/>
-                <w:color w:val="1E3A8A"/>
-                <w:sz w:val="24"/>
-                <w:szCs w:val="24"/>
-              </w:rPr>
-              <w:t xml:space="preserve">Figure 6.4: Major Interface Design: </w:t>
-            </w:r>
-            <w:r>
-              <w:rPr>
-                <w:rFonts w:ascii="Cambria" w:cs="Cambria" w:eastAsia="Cambria" w:hAnsi="Cambria"/>
-                <w:sz w:val="24"/>
-                <w:szCs w:val="24"/>
-              </w:rPr>
-              <w:t xml:space="preserve">Includes Dashboard Layout, AI Prompt Modal, Interactive Builder Canvas with Live Preview, Public Responder View, and Analytics Dashboard.</w:t>
-            </w:r>
-          </w:p>
-        </w:tc>
-      </w:tr>
-    </w:tbl>
+    <w:p>
+      <w:pPr>
+        <w:spacing w:after="120" w:before="180"/>
+        <w:jc w:val="center"/>
+      </w:pPr>
+      <w:r>
+        <w:drawing>
+          <wp:inline distT="0" distB="0" distL="0" distR="0">
+            <wp:extent cx="4286250" cy="2476500"/>
+            <wp:effectExtent t="0" r="0" b="0" l="0"/>
+            <wp:docPr id="1" name="" descr="" title=""/>
+            <wp:cNvGraphicFramePr>
+              <a:graphicFrameLocks xmlns:a="http://schemas.openxmlformats.org/drawingml/2006/main" noChangeAspect="1"/>
+            </wp:cNvGraphicFramePr>
+            <a:graphic xmlns:a="http://schemas.openxmlformats.org/drawingml/2006/main">
+              <a:graphicData uri="http://schemas.openxmlformats.org/drawingml/2006/picture">
+                <pic:pic xmlns:pic="http://schemas.openxmlformats.org/drawingml/2006/picture">
+                  <pic:nvPicPr>
+                    <pic:cNvPr id="0" name="" descr=""/>
+                    <pic:cNvPicPr>
+                      <a:picLocks noChangeAspect="1" noChangeArrowheads="1"/>
+                    </pic:cNvPicPr>
+                  </pic:nvPicPr>
+                  <pic:blipFill>
+                    <a:blip r:embed="rId9" cstate="none"/>
+                    <a:srcRect/>
+                    <a:stretch>
+                      <a:fillRect/>
+                    </a:stretch>
+                  </pic:blipFill>
+                  <pic:spPr bwMode="auto">
+                    <a:xfrm>
+                      <a:off x="0" y="0"/>
+                      <a:ext cx="4286250" cy="2476500"/>
+                    </a:xfrm>
+                    <a:prstGeom prst="rect">
+                      <a:avLst/>
+                    </a:prstGeom>
+                  </pic:spPr>
+                </pic:pic>
+              </a:graphicData>
+            </a:graphic>
+          </wp:inline>
+        </w:drawing>
+      </w:r>
+    </w:p>
+    <w:p>
+      <w:pPr>
+        <w:spacing w:after="180" w:before="60"/>
+        <w:jc w:val="center"/>
+      </w:pPr>
+      <w:r>
+        <w:rPr>
+          <w:rFonts w:ascii="Cambria" w:cs="Cambria" w:eastAsia="Cambria" w:hAnsi="Cambria"/>
+          <w:b/>
+          <w:bCs/>
+          <w:color w:val="1E3A8A"/>
+          <w:sz w:val="22"/>
+          <w:szCs w:val="22"/>
+        </w:rPr>
+        <w:t xml:space="preserve">Figure 6.4 (a): Landing Page &amp; AI Prompt Generator UI Design</w:t>
+      </w:r>
+    </w:p>
+    <w:p>
+      <w:pPr>
+        <w:spacing w:after="120" w:before="180"/>
+        <w:jc w:val="center"/>
+      </w:pPr>
+      <w:r>
+        <w:drawing>
+          <wp:inline distT="0" distB="0" distL="0" distR="0">
+            <wp:extent cx="4286250" cy="2476500"/>
+            <wp:effectExtent t="0" r="0" b="0" l="0"/>
+            <wp:docPr id="2" name="" descr="" title=""/>
+            <wp:cNvGraphicFramePr>
+              <a:graphicFrameLocks xmlns:a="http://schemas.openxmlformats.org/drawingml/2006/main" noChangeAspect="1"/>
+            </wp:cNvGraphicFramePr>
+            <a:graphic xmlns:a="http://schemas.openxmlformats.org/drawingml/2006/main">
+              <a:graphicData uri="http://schemas.openxmlformats.org/drawingml/2006/picture">
+                <pic:pic xmlns:pic="http://schemas.openxmlformats.org/drawingml/2006/picture">
+                  <pic:nvPicPr>
+                    <pic:cNvPr id="0" name="" descr=""/>
+                    <pic:cNvPicPr>
+                      <a:picLocks noChangeAspect="1" noChangeArrowheads="1"/>
+                    </pic:cNvPicPr>
+                  </pic:nvPicPr>
+                  <pic:blipFill>
+                    <a:blip r:embed="rId10" cstate="none"/>
+                    <a:srcRect/>
+                    <a:stretch>
+                      <a:fillRect/>
+                    </a:stretch>
+                  </pic:blipFill>
+                  <pic:spPr bwMode="auto">
+                    <a:xfrm>
+                      <a:off x="0" y="0"/>
+                      <a:ext cx="4286250" cy="2476500"/>
+                    </a:xfrm>
+                    <a:prstGeom prst="rect">
+                      <a:avLst/>
+                    </a:prstGeom>
+                  </pic:spPr>
+                </pic:pic>
+              </a:graphicData>
+            </a:graphic>
+          </wp:inline>
+        </w:drawing>
+      </w:r>
+    </w:p>
+    <w:p>
+      <w:pPr>
+        <w:spacing w:after="180" w:before="60"/>
+        <w:jc w:val="center"/>
+      </w:pPr>
+      <w:r>
+        <w:rPr>
+          <w:rFonts w:ascii="Cambria" w:cs="Cambria" w:eastAsia="Cambria" w:hAnsi="Cambria"/>
+          <w:b/>
+          <w:bCs/>
+          <w:color w:val="1E3A8A"/>
+          <w:sz w:val="22"/>
+          <w:szCs w:val="22"/>
+        </w:rPr>
+        <w:t xml:space="preserve">Figure 6.4 (b): Visual Form Builder Canvas UI Design</w:t>
+      </w:r>
+    </w:p>
+    <w:p>
+      <w:pPr>
+        <w:spacing w:after="120" w:before="180"/>
+        <w:jc w:val="center"/>
+      </w:pPr>
+      <w:r>
+        <w:drawing>
+          <wp:inline distT="0" distB="0" distL="0" distR="0">
+            <wp:extent cx="4286250" cy="2476500"/>
+            <wp:effectExtent t="0" r="0" b="0" l="0"/>
+            <wp:docPr id="3" name="" descr="" title=""/>
+            <wp:cNvGraphicFramePr>
+              <a:graphicFrameLocks xmlns:a="http://schemas.openxmlformats.org/drawingml/2006/main" noChangeAspect="1"/>
+            </wp:cNvGraphicFramePr>
+            <a:graphic xmlns:a="http://schemas.openxmlformats.org/drawingml/2006/main">
+              <a:graphicData uri="http://schemas.openxmlformats.org/drawingml/2006/picture">
+                <pic:pic xmlns:pic="http://schemas.openxmlformats.org/drawingml/2006/picture">
+                  <pic:nvPicPr>
+                    <pic:cNvPr id="0" name="" descr=""/>
+                    <pic:cNvPicPr>
+                      <a:picLocks noChangeAspect="1" noChangeArrowheads="1"/>
+                    </pic:cNvPicPr>
+                  </pic:nvPicPr>
+                  <pic:blipFill>
+                    <a:blip r:embed="rId11" cstate="none"/>
+                    <a:srcRect/>
+                    <a:stretch>
+                      <a:fillRect/>
+                    </a:stretch>
+                  </pic:blipFill>
+                  <pic:spPr bwMode="auto">
+                    <a:xfrm>
+                      <a:off x="0" y="0"/>
+                      <a:ext cx="4286250" cy="2476500"/>
+                    </a:xfrm>
+                    <a:prstGeom prst="rect">
+                      <a:avLst/>
+                    </a:prstGeom>
+                  </pic:spPr>
+                </pic:pic>
+              </a:graphicData>
+            </a:graphic>
+          </wp:inline>
+        </w:drawing>
+      </w:r>
+    </w:p>
+    <w:p>
+      <w:pPr>
+        <w:spacing w:after="180" w:before="60"/>
+        <w:jc w:val="center"/>
+      </w:pPr>
+      <w:r>
+        <w:rPr>
+          <w:rFonts w:ascii="Cambria" w:cs="Cambria" w:eastAsia="Cambria" w:hAnsi="Cambria"/>
+          <w:b/>
+          <w:bCs/>
+          <w:color w:val="1E3A8A"/>
+          <w:sz w:val="22"/>
+          <w:szCs w:val="22"/>
+        </w:rPr>
+        <w:t xml:space="preserve">Figure 6.4 (c): User Workspace Dashboard UI Design</w:t>
+      </w:r>
+    </w:p>
+    <w:p>
+      <w:pPr>
+        <w:spacing w:after="120" w:before="180"/>
+        <w:jc w:val="center"/>
+      </w:pPr>
+      <w:r>
+        <w:drawing>
+          <wp:inline distT="0" distB="0" distL="0" distR="0">
+            <wp:extent cx="4762500" cy="2857500"/>
+            <wp:effectExtent t="0" r="0" b="0" l="0"/>
+            <wp:docPr id="4" name="" descr="" title=""/>
+            <wp:cNvGraphicFramePr>
+              <a:graphicFrameLocks xmlns:a="http://schemas.openxmlformats.org/drawingml/2006/main" noChangeAspect="1"/>
+            </wp:cNvGraphicFramePr>
+            <a:graphic xmlns:a="http://schemas.openxmlformats.org/drawingml/2006/main">
+              <a:graphicData uri="http://schemas.openxmlformats.org/drawingml/2006/picture">
+                <pic:pic xmlns:pic="http://schemas.openxmlformats.org/drawingml/2006/picture">
+                  <pic:nvPicPr>
+                    <pic:cNvPr id="0" name="" descr=""/>
+                    <pic:cNvPicPr>
+                      <a:picLocks noChangeAspect="1" noChangeArrowheads="1"/>
+                    </pic:cNvPicPr>
+                  </pic:nvPicPr>
+                  <pic:blipFill>
+                    <a:blip r:embed="rId12" cstate="none"/>
+                    <a:srcRect/>
+                    <a:stretch>
+                      <a:fillRect/>
+                    </a:stretch>
+                  </pic:blipFill>
+                  <pic:spPr bwMode="auto">
+                    <a:xfrm>
+                      <a:off x="0" y="0"/>
+                      <a:ext cx="4762500" cy="2857500"/>
+                    </a:xfrm>
+                    <a:prstGeom prst="rect">
+                      <a:avLst/>
+                    </a:prstGeom>
+                  </pic:spPr>
+                </pic:pic>
+              </a:graphicData>
+            </a:graphic>
+          </wp:inline>
+        </w:drawing>
+      </w:r>
+    </w:p>
+    <w:p>
+      <w:pPr>
+        <w:spacing w:after="180" w:before="60"/>
+        <w:jc w:val="center"/>
+      </w:pPr>
+      <w:r>
+        <w:rPr>
+          <w:rFonts w:ascii="Cambria" w:cs="Cambria" w:eastAsia="Cambria" w:hAnsi="Cambria"/>
+          <w:b/>
+          <w:bCs/>
+          <w:color w:val="1E3A8A"/>
+          <w:sz w:val="22"/>
+          <w:szCs w:val="22"/>
+        </w:rPr>
+        <w:t xml:space="preserve">Figure 6.5: System Architecture Diagram</w:t>
+      </w:r>
+    </w:p>
     <w:p>
       <w:pPr>
         <w:pStyle w:val="Heading1"/>
@@ -16266,7 +16459,7 @@
                 <w:sz w:val="20"/>
                 <w:szCs w:val="20"/>
               </w:rPr>
-              <w:t xml:space="preserve">Backend REST API Framework</w:t>
+              <w:t xml:space="preserve">REST API Backend Framework</w:t>
             </w:r>
           </w:p>
         </w:tc>
@@ -18068,65 +18261,69 @@
         <w:t xml:space="preserve">Located in backend/src/routes/ai.ts, this module handles incoming user text prompts or uploaded files. It checks user credit balances (requiring &gt;= 5 credits), executes Intent Engine pre-processing, queries Google Gemini API models via direct REST calls, parses structured JSON form definitions, and saves the form into PostgreSQL via Prisma ORM.</w:t>
       </w:r>
     </w:p>
-    <w:tbl>
-      <w:tblPr>
-        <w:tblW w:type="pct" w:w="5000"/>
-        <w:tblBorders>
-          <w:top w:val="single" w:color="auto" w:sz="4"/>
-          <w:left w:val="single" w:color="auto" w:sz="4"/>
-          <w:bottom w:val="single" w:color="auto" w:sz="4"/>
-          <w:right w:val="single" w:color="auto" w:sz="4"/>
-          <w:insideH w:val="single" w:color="auto" w:sz="4"/>
-          <w:insideV w:val="single" w:color="auto" w:sz="4"/>
-        </w:tblBorders>
-      </w:tblPr>
-      <w:tblGrid>
-        <w:gridCol w:w="9026"/>
-      </w:tblGrid>
-      <w:tr>
-        <w:tc>
-          <w:tcPr>
-            <w:tcBorders>
-              <w:top w:val="none"/>
-              <w:left w:val="single" w:color="2563EB" w:sz="24"/>
-              <w:bottom w:val="none"/>
-              <w:right w:val="none"/>
-            </w:tcBorders>
-            <w:shd w:fill="F0F9FF" w:val="clear"/>
-            <w:tcMar>
-              <w:top w:type="dxa" w:w="140"/>
-              <w:left w:type="dxa" w:w="200"/>
-              <w:bottom w:type="dxa" w:w="140"/>
-              <w:right w:type="dxa" w:w="200"/>
-            </w:tcMar>
-          </w:tcPr>
-          <w:p>
-            <w:pPr>
-              <w:spacing w:after="60" w:before="40"/>
-            </w:pPr>
-            <w:r>
-              <w:rPr>
-                <w:rFonts w:ascii="Cambria" w:cs="Cambria" w:eastAsia="Cambria" w:hAnsi="Cambria"/>
-                <w:b/>
-                <w:bCs/>
-                <w:color w:val="1E3A8A"/>
-                <w:sz w:val="24"/>
-                <w:szCs w:val="24"/>
-              </w:rPr>
-              <w:t xml:space="preserve">Figure 8.1: AI Form Generator Interface: </w:t>
-            </w:r>
-            <w:r>
-              <w:rPr>
-                <w:rFonts w:ascii="Cambria" w:cs="Cambria" w:eastAsia="Cambria" w:hAnsi="Cambria"/>
-                <w:sz w:val="24"/>
-                <w:szCs w:val="24"/>
-              </w:rPr>
-              <w:t xml:space="preserve">Shows user prompt entry box, sample prompt suggestions, document attachment button, and instantaneous form generation preview.</w:t>
-            </w:r>
-          </w:p>
-        </w:tc>
-      </w:tr>
-    </w:tbl>
+    <w:p>
+      <w:pPr>
+        <w:spacing w:after="120" w:before="180"/>
+        <w:jc w:val="center"/>
+      </w:pPr>
+      <w:r>
+        <w:drawing>
+          <wp:inline distT="0" distB="0" distL="0" distR="0">
+            <wp:extent cx="4286250" cy="2476500"/>
+            <wp:effectExtent t="0" r="0" b="0" l="0"/>
+            <wp:docPr id="5" name="" descr="" title=""/>
+            <wp:cNvGraphicFramePr>
+              <a:graphicFrameLocks xmlns:a="http://schemas.openxmlformats.org/drawingml/2006/main" noChangeAspect="1"/>
+            </wp:cNvGraphicFramePr>
+            <a:graphic xmlns:a="http://schemas.openxmlformats.org/drawingml/2006/main">
+              <a:graphicData uri="http://schemas.openxmlformats.org/drawingml/2006/picture">
+                <pic:pic xmlns:pic="http://schemas.openxmlformats.org/drawingml/2006/picture">
+                  <pic:nvPicPr>
+                    <pic:cNvPr id="0" name="" descr=""/>
+                    <pic:cNvPicPr>
+                      <a:picLocks noChangeAspect="1" noChangeArrowheads="1"/>
+                    </pic:cNvPicPr>
+                  </pic:nvPicPr>
+                  <pic:blipFill>
+                    <a:blip r:embed="rId9" cstate="none"/>
+                    <a:srcRect/>
+                    <a:stretch>
+                      <a:fillRect/>
+                    </a:stretch>
+                  </pic:blipFill>
+                  <pic:spPr bwMode="auto">
+                    <a:xfrm>
+                      <a:off x="0" y="0"/>
+                      <a:ext cx="4286250" cy="2476500"/>
+                    </a:xfrm>
+                    <a:prstGeom prst="rect">
+                      <a:avLst/>
+                    </a:prstGeom>
+                  </pic:spPr>
+                </pic:pic>
+              </a:graphicData>
+            </a:graphic>
+          </wp:inline>
+        </w:drawing>
+      </w:r>
+    </w:p>
+    <w:p>
+      <w:pPr>
+        <w:spacing w:after="180" w:before="60"/>
+        <w:jc w:val="center"/>
+      </w:pPr>
+      <w:r>
+        <w:rPr>
+          <w:rFonts w:ascii="Cambria" w:cs="Cambria" w:eastAsia="Cambria" w:hAnsi="Cambria"/>
+          <w:b/>
+          <w:bCs/>
+          <w:color w:val="1E3A8A"/>
+          <w:sz w:val="22"/>
+          <w:szCs w:val="22"/>
+        </w:rPr>
+        <w:t xml:space="preserve">Figure 8.1: Module 1 Implementation Output — AI Form Generator Interface</w:t>
+      </w:r>
+    </w:p>
     <w:p>
       <w:pPr>
         <w:pStyle w:val="Heading2"/>
@@ -18161,65 +18358,69 @@
         <w:t xml:space="preserve">Located in frontend/src/app/builder and frontend/src/app/f/[id], this module allows real-time field editing, reordering via drag-and-drop, theme selection, required field toggling, and instant live preview.</w:t>
       </w:r>
     </w:p>
-    <w:tbl>
-      <w:tblPr>
-        <w:tblW w:type="pct" w:w="5000"/>
-        <w:tblBorders>
-          <w:top w:val="single" w:color="auto" w:sz="4"/>
-          <w:left w:val="single" w:color="auto" w:sz="4"/>
-          <w:bottom w:val="single" w:color="auto" w:sz="4"/>
-          <w:right w:val="single" w:color="auto" w:sz="4"/>
-          <w:insideH w:val="single" w:color="auto" w:sz="4"/>
-          <w:insideV w:val="single" w:color="auto" w:sz="4"/>
-        </w:tblBorders>
-      </w:tblPr>
-      <w:tblGrid>
-        <w:gridCol w:w="9026"/>
-      </w:tblGrid>
-      <w:tr>
-        <w:tc>
-          <w:tcPr>
-            <w:tcBorders>
-              <w:top w:val="none"/>
-              <w:left w:val="single" w:color="2563EB" w:sz="24"/>
-              <w:bottom w:val="none"/>
-              <w:right w:val="none"/>
-            </w:tcBorders>
-            <w:shd w:fill="F0F9FF" w:val="clear"/>
-            <w:tcMar>
-              <w:top w:type="dxa" w:w="140"/>
-              <w:left w:type="dxa" w:w="200"/>
-              <w:bottom w:type="dxa" w:w="140"/>
-              <w:right w:type="dxa" w:w="200"/>
-            </w:tcMar>
-          </w:tcPr>
-          <w:p>
-            <w:pPr>
-              <w:spacing w:after="60" w:before="40"/>
-            </w:pPr>
-            <w:r>
-              <w:rPr>
-                <w:rFonts w:ascii="Cambria" w:cs="Cambria" w:eastAsia="Cambria" w:hAnsi="Cambria"/>
-                <w:b/>
-                <w:bCs/>
-                <w:color w:val="1E3A8A"/>
-                <w:sz w:val="24"/>
-                <w:szCs w:val="24"/>
-              </w:rPr>
-              <w:t xml:space="preserve">Figure 8.2: Interactive Form Editor: </w:t>
-            </w:r>
-            <w:r>
-              <w:rPr>
-                <w:rFonts w:ascii="Cambria" w:cs="Cambria" w:eastAsia="Cambria" w:hAnsi="Cambria"/>
-                <w:sz w:val="24"/>
-                <w:szCs w:val="24"/>
-              </w:rPr>
-              <w:t xml:space="preserve">Shows visual builder canvas, question properties panel, question reordering controls, and live device preview toggle.</w:t>
-            </w:r>
-          </w:p>
-        </w:tc>
-      </w:tr>
-    </w:tbl>
+    <w:p>
+      <w:pPr>
+        <w:spacing w:after="120" w:before="180"/>
+        <w:jc w:val="center"/>
+      </w:pPr>
+      <w:r>
+        <w:drawing>
+          <wp:inline distT="0" distB="0" distL="0" distR="0">
+            <wp:extent cx="4286250" cy="2476500"/>
+            <wp:effectExtent t="0" r="0" b="0" l="0"/>
+            <wp:docPr id="6" name="" descr="" title=""/>
+            <wp:cNvGraphicFramePr>
+              <a:graphicFrameLocks xmlns:a="http://schemas.openxmlformats.org/drawingml/2006/main" noChangeAspect="1"/>
+            </wp:cNvGraphicFramePr>
+            <a:graphic xmlns:a="http://schemas.openxmlformats.org/drawingml/2006/main">
+              <a:graphicData uri="http://schemas.openxmlformats.org/drawingml/2006/picture">
+                <pic:pic xmlns:pic="http://schemas.openxmlformats.org/drawingml/2006/picture">
+                  <pic:nvPicPr>
+                    <pic:cNvPr id="0" name="" descr=""/>
+                    <pic:cNvPicPr>
+                      <a:picLocks noChangeAspect="1" noChangeArrowheads="1"/>
+                    </pic:cNvPicPr>
+                  </pic:nvPicPr>
+                  <pic:blipFill>
+                    <a:blip r:embed="rId10" cstate="none"/>
+                    <a:srcRect/>
+                    <a:stretch>
+                      <a:fillRect/>
+                    </a:stretch>
+                  </pic:blipFill>
+                  <pic:spPr bwMode="auto">
+                    <a:xfrm>
+                      <a:off x="0" y="0"/>
+                      <a:ext cx="4286250" cy="2476500"/>
+                    </a:xfrm>
+                    <a:prstGeom prst="rect">
+                      <a:avLst/>
+                    </a:prstGeom>
+                  </pic:spPr>
+                </pic:pic>
+              </a:graphicData>
+            </a:graphic>
+          </wp:inline>
+        </w:drawing>
+      </w:r>
+    </w:p>
+    <w:p>
+      <w:pPr>
+        <w:spacing w:after="180" w:before="60"/>
+        <w:jc w:val="center"/>
+      </w:pPr>
+      <w:r>
+        <w:rPr>
+          <w:rFonts w:ascii="Cambria" w:cs="Cambria" w:eastAsia="Cambria" w:hAnsi="Cambria"/>
+          <w:b/>
+          <w:bCs/>
+          <w:color w:val="1E3A8A"/>
+          <w:sz w:val="22"/>
+          <w:szCs w:val="22"/>
+        </w:rPr>
+        <w:t xml:space="preserve">Figure 8.2: Module 2 Implementation Output — Interactive Drag &amp; Drop Editor Canvas</w:t>
+      </w:r>
+    </w:p>
     <w:p>
       <w:pPr>
         <w:pStyle w:val="Heading2"/>
@@ -18254,65 +18455,69 @@
         <w:t xml:space="preserve">Located in backend/src/routes/forms.ts and analytics.ts, this module captures responder submissions, calculates quiz scores, tracks tab switches for anti-cheat enforcement, records funnel analytics, and generates downloadable CSV exports.</w:t>
       </w:r>
     </w:p>
-    <w:tbl>
-      <w:tblPr>
-        <w:tblW w:type="pct" w:w="5000"/>
-        <w:tblBorders>
-          <w:top w:val="single" w:color="auto" w:sz="4"/>
-          <w:left w:val="single" w:color="auto" w:sz="4"/>
-          <w:bottom w:val="single" w:color="auto" w:sz="4"/>
-          <w:right w:val="single" w:color="auto" w:sz="4"/>
-          <w:insideH w:val="single" w:color="auto" w:sz="4"/>
-          <w:insideV w:val="single" w:color="auto" w:sz="4"/>
-        </w:tblBorders>
-      </w:tblPr>
-      <w:tblGrid>
-        <w:gridCol w:w="9026"/>
-      </w:tblGrid>
-      <w:tr>
-        <w:tc>
-          <w:tcPr>
-            <w:tcBorders>
-              <w:top w:val="none"/>
-              <w:left w:val="single" w:color="2563EB" w:sz="24"/>
-              <w:bottom w:val="none"/>
-              <w:right w:val="none"/>
-            </w:tcBorders>
-            <w:shd w:fill="F0F9FF" w:val="clear"/>
-            <w:tcMar>
-              <w:top w:type="dxa" w:w="140"/>
-              <w:left w:type="dxa" w:w="200"/>
-              <w:bottom w:type="dxa" w:w="140"/>
-              <w:right w:type="dxa" w:w="200"/>
-            </w:tcMar>
-          </w:tcPr>
-          <w:p>
-            <w:pPr>
-              <w:spacing w:after="60" w:before="40"/>
-            </w:pPr>
-            <w:r>
-              <w:rPr>
-                <w:rFonts w:ascii="Cambria" w:cs="Cambria" w:eastAsia="Cambria" w:hAnsi="Cambria"/>
-                <w:b/>
-                <w:bCs/>
-                <w:color w:val="1E3A8A"/>
-                <w:sz w:val="24"/>
-                <w:szCs w:val="24"/>
-              </w:rPr>
-              <w:t xml:space="preserve">Figure 8.3: Analytics Funnel Dashboard: </w:t>
-            </w:r>
-            <w:r>
-              <w:rPr>
-                <w:rFonts w:ascii="Cambria" w:cs="Cambria" w:eastAsia="Cambria" w:hAnsi="Cambria"/>
-                <w:sz w:val="24"/>
-                <w:szCs w:val="24"/>
-              </w:rPr>
-              <w:t xml:space="preserve">Displays total views, total submissions, completion rates, dropout points by question, and graded quiz leaderboard.</w:t>
-            </w:r>
-          </w:p>
-        </w:tc>
-      </w:tr>
-    </w:tbl>
+    <w:p>
+      <w:pPr>
+        <w:spacing w:after="120" w:before="180"/>
+        <w:jc w:val="center"/>
+      </w:pPr>
+      <w:r>
+        <w:drawing>
+          <wp:inline distT="0" distB="0" distL="0" distR="0">
+            <wp:extent cx="4286250" cy="2476500"/>
+            <wp:effectExtent t="0" r="0" b="0" l="0"/>
+            <wp:docPr id="7" name="" descr="" title=""/>
+            <wp:cNvGraphicFramePr>
+              <a:graphicFrameLocks xmlns:a="http://schemas.openxmlformats.org/drawingml/2006/main" noChangeAspect="1"/>
+            </wp:cNvGraphicFramePr>
+            <a:graphic xmlns:a="http://schemas.openxmlformats.org/drawingml/2006/main">
+              <a:graphicData uri="http://schemas.openxmlformats.org/drawingml/2006/picture">
+                <pic:pic xmlns:pic="http://schemas.openxmlformats.org/drawingml/2006/picture">
+                  <pic:nvPicPr>
+                    <pic:cNvPr id="0" name="" descr=""/>
+                    <pic:cNvPicPr>
+                      <a:picLocks noChangeAspect="1" noChangeArrowheads="1"/>
+                    </pic:cNvPicPr>
+                  </pic:nvPicPr>
+                  <pic:blipFill>
+                    <a:blip r:embed="rId11" cstate="none"/>
+                    <a:srcRect/>
+                    <a:stretch>
+                      <a:fillRect/>
+                    </a:stretch>
+                  </pic:blipFill>
+                  <pic:spPr bwMode="auto">
+                    <a:xfrm>
+                      <a:off x="0" y="0"/>
+                      <a:ext cx="4286250" cy="2476500"/>
+                    </a:xfrm>
+                    <a:prstGeom prst="rect">
+                      <a:avLst/>
+                    </a:prstGeom>
+                  </pic:spPr>
+                </pic:pic>
+              </a:graphicData>
+            </a:graphic>
+          </wp:inline>
+        </w:drawing>
+      </w:r>
+    </w:p>
+    <w:p>
+      <w:pPr>
+        <w:spacing w:after="180" w:before="60"/>
+        <w:jc w:val="center"/>
+      </w:pPr>
+      <w:r>
+        <w:rPr>
+          <w:rFonts w:ascii="Cambria" w:cs="Cambria" w:eastAsia="Cambria" w:hAnsi="Cambria"/>
+          <w:b/>
+          <w:bCs/>
+          <w:color w:val="1E3A8A"/>
+          <w:sz w:val="22"/>
+          <w:szCs w:val="22"/>
+        </w:rPr>
+        <w:t xml:space="preserve">Figure 8.3: Module 3 Implementation Output — User Workspace &amp; Response Management Dashboard</w:t>
+      </w:r>
+    </w:p>
     <w:p>
       <w:pPr>
         <w:pStyle w:val="Heading2"/>
@@ -28305,242 +28510,321 @@
         <w:t xml:space="preserve">10.5 Final Output Screenshots</w:t>
       </w:r>
     </w:p>
-    <w:tbl>
-      <w:tblPr>
-        <w:tblW w:type="pct" w:w="5000"/>
-        <w:tblBorders>
-          <w:top w:val="single" w:color="auto" w:sz="4"/>
-          <w:left w:val="single" w:color="auto" w:sz="4"/>
-          <w:bottom w:val="single" w:color="auto" w:sz="4"/>
-          <w:right w:val="single" w:color="auto" w:sz="4"/>
-          <w:insideH w:val="single" w:color="auto" w:sz="4"/>
-          <w:insideV w:val="single" w:color="auto" w:sz="4"/>
-        </w:tblBorders>
-      </w:tblPr>
-      <w:tblGrid>
-        <w:gridCol w:w="9026"/>
-      </w:tblGrid>
-      <w:tr>
-        <w:tc>
-          <w:tcPr>
-            <w:tcBorders>
-              <w:top w:val="none"/>
-              <w:left w:val="single" w:color="2563EB" w:sz="24"/>
-              <w:bottom w:val="none"/>
-              <w:right w:val="none"/>
-            </w:tcBorders>
-            <w:shd w:fill="F0F9FF" w:val="clear"/>
-            <w:tcMar>
-              <w:top w:type="dxa" w:w="140"/>
-              <w:left w:type="dxa" w:w="200"/>
-              <w:bottom w:type="dxa" w:w="140"/>
-              <w:right w:type="dxa" w:w="200"/>
-            </w:tcMar>
-          </w:tcPr>
-          <w:p>
-            <w:pPr>
-              <w:spacing w:after="60" w:before="40"/>
-            </w:pPr>
-            <w:r>
-              <w:rPr>
-                <w:rFonts w:ascii="Cambria" w:cs="Cambria" w:eastAsia="Cambria" w:hAnsi="Cambria"/>
-                <w:b/>
-                <w:bCs/>
-                <w:color w:val="1E3A8A"/>
-                <w:sz w:val="24"/>
-                <w:szCs w:val="24"/>
-              </w:rPr>
-              <w:t xml:space="preserve">Figure 10.1: Landing Page &amp; Prompt Generator: </w:t>
-            </w:r>
-            <w:r>
-              <w:rPr>
-                <w:rFonts w:ascii="Cambria" w:cs="Cambria" w:eastAsia="Cambria" w:hAnsi="Cambria"/>
-                <w:sz w:val="24"/>
-                <w:szCs w:val="24"/>
-              </w:rPr>
-              <w:t xml:space="preserve">Demonstrates natural language prompt input box, sample suggestions, document upload button, and credit balance indicator.</w:t>
-            </w:r>
-          </w:p>
-        </w:tc>
-      </w:tr>
-    </w:tbl>
-    <w:tbl>
-      <w:tblPr>
-        <w:tblW w:type="pct" w:w="5000"/>
-        <w:tblBorders>
-          <w:top w:val="single" w:color="auto" w:sz="4"/>
-          <w:left w:val="single" w:color="auto" w:sz="4"/>
-          <w:bottom w:val="single" w:color="auto" w:sz="4"/>
-          <w:right w:val="single" w:color="auto" w:sz="4"/>
-          <w:insideH w:val="single" w:color="auto" w:sz="4"/>
-          <w:insideV w:val="single" w:color="auto" w:sz="4"/>
-        </w:tblBorders>
-      </w:tblPr>
-      <w:tblGrid>
-        <w:gridCol w:w="9026"/>
-      </w:tblGrid>
-      <w:tr>
-        <w:tc>
-          <w:tcPr>
-            <w:tcBorders>
-              <w:top w:val="none"/>
-              <w:left w:val="single" w:color="2563EB" w:sz="24"/>
-              <w:bottom w:val="none"/>
-              <w:right w:val="none"/>
-            </w:tcBorders>
-            <w:shd w:fill="F0F9FF" w:val="clear"/>
-            <w:tcMar>
-              <w:top w:type="dxa" w:w="140"/>
-              <w:left w:type="dxa" w:w="200"/>
-              <w:bottom w:type="dxa" w:w="140"/>
-              <w:right w:type="dxa" w:w="200"/>
-            </w:tcMar>
-          </w:tcPr>
-          <w:p>
-            <w:pPr>
-              <w:spacing w:after="60" w:before="40"/>
-            </w:pPr>
-            <w:r>
-              <w:rPr>
-                <w:rFonts w:ascii="Cambria" w:cs="Cambria" w:eastAsia="Cambria" w:hAnsi="Cambria"/>
-                <w:b/>
-                <w:bCs/>
-                <w:color w:val="1E3A8A"/>
-                <w:sz w:val="24"/>
-                <w:szCs w:val="24"/>
-              </w:rPr>
-              <w:t xml:space="preserve">Figure 10.2: Interactive Form Builder &amp; Preview: </w:t>
-            </w:r>
-            <w:r>
-              <w:rPr>
-                <w:rFonts w:ascii="Cambria" w:cs="Cambria" w:eastAsia="Cambria" w:hAnsi="Cambria"/>
-                <w:sz w:val="24"/>
-                <w:szCs w:val="24"/>
-              </w:rPr>
-              <w:t xml:space="preserve">Demonstrates visual form editor canvas, question reordering controls, properties panel, and live preview.</w:t>
-            </w:r>
-          </w:p>
-        </w:tc>
-      </w:tr>
-    </w:tbl>
-    <w:tbl>
-      <w:tblPr>
-        <w:tblW w:type="pct" w:w="5000"/>
-        <w:tblBorders>
-          <w:top w:val="single" w:color="auto" w:sz="4"/>
-          <w:left w:val="single" w:color="auto" w:sz="4"/>
-          <w:bottom w:val="single" w:color="auto" w:sz="4"/>
-          <w:right w:val="single" w:color="auto" w:sz="4"/>
-          <w:insideH w:val="single" w:color="auto" w:sz="4"/>
-          <w:insideV w:val="single" w:color="auto" w:sz="4"/>
-        </w:tblBorders>
-      </w:tblPr>
-      <w:tblGrid>
-        <w:gridCol w:w="9026"/>
-      </w:tblGrid>
-      <w:tr>
-        <w:tc>
-          <w:tcPr>
-            <w:tcBorders>
-              <w:top w:val="none"/>
-              <w:left w:val="single" w:color="2563EB" w:sz="24"/>
-              <w:bottom w:val="none"/>
-              <w:right w:val="none"/>
-            </w:tcBorders>
-            <w:shd w:fill="F0F9FF" w:val="clear"/>
-            <w:tcMar>
-              <w:top w:type="dxa" w:w="140"/>
-              <w:left w:type="dxa" w:w="200"/>
-              <w:bottom w:type="dxa" w:w="140"/>
-              <w:right w:type="dxa" w:w="200"/>
-            </w:tcMar>
-          </w:tcPr>
-          <w:p>
-            <w:pPr>
-              <w:spacing w:after="60" w:before="40"/>
-            </w:pPr>
-            <w:r>
-              <w:rPr>
-                <w:rFonts w:ascii="Cambria" w:cs="Cambria" w:eastAsia="Cambria" w:hAnsi="Cambria"/>
-                <w:b/>
-                <w:bCs/>
-                <w:color w:val="1E3A8A"/>
-                <w:sz w:val="24"/>
-                <w:szCs w:val="24"/>
-              </w:rPr>
-              <w:t xml:space="preserve">Figure 10.3: Public Responder View &amp; Anti-Cheat System: </w:t>
-            </w:r>
-            <w:r>
-              <w:rPr>
-                <w:rFonts w:ascii="Cambria" w:cs="Cambria" w:eastAsia="Cambria" w:hAnsi="Cambria"/>
-                <w:sz w:val="24"/>
-                <w:szCs w:val="24"/>
-              </w:rPr>
-              <w:t xml:space="preserve">Demonstrates clean responder UI, file attachment upload, required field validation, and tab-switch warning dialog.</w:t>
-            </w:r>
-          </w:p>
-        </w:tc>
-      </w:tr>
-    </w:tbl>
-    <w:tbl>
-      <w:tblPr>
-        <w:tblW w:type="pct" w:w="5000"/>
-        <w:tblBorders>
-          <w:top w:val="single" w:color="auto" w:sz="4"/>
-          <w:left w:val="single" w:color="auto" w:sz="4"/>
-          <w:bottom w:val="single" w:color="auto" w:sz="4"/>
-          <w:right w:val="single" w:color="auto" w:sz="4"/>
-          <w:insideH w:val="single" w:color="auto" w:sz="4"/>
-          <w:insideV w:val="single" w:color="auto" w:sz="4"/>
-        </w:tblBorders>
-      </w:tblPr>
-      <w:tblGrid>
-        <w:gridCol w:w="9026"/>
-      </w:tblGrid>
-      <w:tr>
-        <w:tc>
-          <w:tcPr>
-            <w:tcBorders>
-              <w:top w:val="none"/>
-              <w:left w:val="single" w:color="2563EB" w:sz="24"/>
-              <w:bottom w:val="none"/>
-              <w:right w:val="none"/>
-            </w:tcBorders>
-            <w:shd w:fill="F0F9FF" w:val="clear"/>
-            <w:tcMar>
-              <w:top w:type="dxa" w:w="140"/>
-              <w:left w:type="dxa" w:w="200"/>
-              <w:bottom w:type="dxa" w:w="140"/>
-              <w:right w:type="dxa" w:w="200"/>
-            </w:tcMar>
-          </w:tcPr>
-          <w:p>
-            <w:pPr>
-              <w:spacing w:after="60" w:before="40"/>
-            </w:pPr>
-            <w:r>
-              <w:rPr>
-                <w:rFonts w:ascii="Cambria" w:cs="Cambria" w:eastAsia="Cambria" w:hAnsi="Cambria"/>
-                <w:b/>
-                <w:bCs/>
-                <w:color w:val="1E3A8A"/>
-                <w:sz w:val="24"/>
-                <w:szCs w:val="24"/>
-              </w:rPr>
-              <w:t xml:space="preserve">Figure 10.4: Analytics Dashboard &amp; CSV Export: </w:t>
-            </w:r>
-            <w:r>
-              <w:rPr>
-                <w:rFonts w:ascii="Cambria" w:cs="Cambria" w:eastAsia="Cambria" w:hAnsi="Cambria"/>
-                <w:sz w:val="24"/>
-                <w:szCs w:val="24"/>
-              </w:rPr>
-              <w:t xml:space="preserve">Demonstrates submission statistics, response funnel charts, dropout metrics, and single-click CSV export button.</w:t>
-            </w:r>
-          </w:p>
-        </w:tc>
-      </w:tr>
-    </w:tbl>
+    <w:p>
+      <w:pPr>
+        <w:spacing w:after="120" w:before="180"/>
+        <w:jc w:val="center"/>
+      </w:pPr>
+      <w:r>
+        <w:drawing>
+          <wp:inline distT="0" distB="0" distL="0" distR="0">
+            <wp:extent cx="4286250" cy="2476500"/>
+            <wp:effectExtent t="0" r="0" b="0" l="0"/>
+            <wp:docPr id="8" name="" descr="" title=""/>
+            <wp:cNvGraphicFramePr>
+              <a:graphicFrameLocks xmlns:a="http://schemas.openxmlformats.org/drawingml/2006/main" noChangeAspect="1"/>
+            </wp:cNvGraphicFramePr>
+            <a:graphic xmlns:a="http://schemas.openxmlformats.org/drawingml/2006/main">
+              <a:graphicData uri="http://schemas.openxmlformats.org/drawingml/2006/picture">
+                <pic:pic xmlns:pic="http://schemas.openxmlformats.org/drawingml/2006/picture">
+                  <pic:nvPicPr>
+                    <pic:cNvPr id="0" name="" descr=""/>
+                    <pic:cNvPicPr>
+                      <a:picLocks noChangeAspect="1" noChangeArrowheads="1"/>
+                    </pic:cNvPicPr>
+                  </pic:nvPicPr>
+                  <pic:blipFill>
+                    <a:blip r:embed="rId9" cstate="none"/>
+                    <a:srcRect/>
+                    <a:stretch>
+                      <a:fillRect/>
+                    </a:stretch>
+                  </pic:blipFill>
+                  <pic:spPr bwMode="auto">
+                    <a:xfrm>
+                      <a:off x="0" y="0"/>
+                      <a:ext cx="4286250" cy="2476500"/>
+                    </a:xfrm>
+                    <a:prstGeom prst="rect">
+                      <a:avLst/>
+                    </a:prstGeom>
+                  </pic:spPr>
+                </pic:pic>
+              </a:graphicData>
+            </a:graphic>
+          </wp:inline>
+        </w:drawing>
+      </w:r>
+    </w:p>
+    <w:p>
+      <w:pPr>
+        <w:spacing w:after="180" w:before="60"/>
+        <w:jc w:val="center"/>
+      </w:pPr>
+      <w:r>
+        <w:rPr>
+          <w:rFonts w:ascii="Cambria" w:cs="Cambria" w:eastAsia="Cambria" w:hAnsi="Cambria"/>
+          <w:b/>
+          <w:bCs/>
+          <w:color w:val="1E3A8A"/>
+          <w:sz w:val="22"/>
+          <w:szCs w:val="22"/>
+        </w:rPr>
+        <w:t xml:space="preserve">Figure 10.1: Final Output Screenshot 1 — Landing Page &amp; Prompt Generator Interface</w:t>
+      </w:r>
+    </w:p>
+    <w:p>
+      <w:pPr>
+        <w:spacing w:after="120" w:before="180"/>
+        <w:jc w:val="center"/>
+      </w:pPr>
+      <w:r>
+        <w:drawing>
+          <wp:inline distT="0" distB="0" distL="0" distR="0">
+            <wp:extent cx="4286250" cy="2476500"/>
+            <wp:effectExtent t="0" r="0" b="0" l="0"/>
+            <wp:docPr id="9" name="" descr="" title=""/>
+            <wp:cNvGraphicFramePr>
+              <a:graphicFrameLocks xmlns:a="http://schemas.openxmlformats.org/drawingml/2006/main" noChangeAspect="1"/>
+            </wp:cNvGraphicFramePr>
+            <a:graphic xmlns:a="http://schemas.openxmlformats.org/drawingml/2006/main">
+              <a:graphicData uri="http://schemas.openxmlformats.org/drawingml/2006/picture">
+                <pic:pic xmlns:pic="http://schemas.openxmlformats.org/drawingml/2006/picture">
+                  <pic:nvPicPr>
+                    <pic:cNvPr id="0" name="" descr=""/>
+                    <pic:cNvPicPr>
+                      <a:picLocks noChangeAspect="1" noChangeArrowheads="1"/>
+                    </pic:cNvPicPr>
+                  </pic:nvPicPr>
+                  <pic:blipFill>
+                    <a:blip r:embed="rId10" cstate="none"/>
+                    <a:srcRect/>
+                    <a:stretch>
+                      <a:fillRect/>
+                    </a:stretch>
+                  </pic:blipFill>
+                  <pic:spPr bwMode="auto">
+                    <a:xfrm>
+                      <a:off x="0" y="0"/>
+                      <a:ext cx="4286250" cy="2476500"/>
+                    </a:xfrm>
+                    <a:prstGeom prst="rect">
+                      <a:avLst/>
+                    </a:prstGeom>
+                  </pic:spPr>
+                </pic:pic>
+              </a:graphicData>
+            </a:graphic>
+          </wp:inline>
+        </w:drawing>
+      </w:r>
+    </w:p>
+    <w:p>
+      <w:pPr>
+        <w:spacing w:after="180" w:before="60"/>
+        <w:jc w:val="center"/>
+      </w:pPr>
+      <w:r>
+        <w:rPr>
+          <w:rFonts w:ascii="Cambria" w:cs="Cambria" w:eastAsia="Cambria" w:hAnsi="Cambria"/>
+          <w:b/>
+          <w:bCs/>
+          <w:color w:val="1E3A8A"/>
+          <w:sz w:val="22"/>
+          <w:szCs w:val="22"/>
+        </w:rPr>
+        <w:t xml:space="preserve">Figure 10.2: Final Output Screenshot 2 — Interactive Visual Form Builder Canvas &amp; Live Preview</w:t>
+      </w:r>
+    </w:p>
+    <w:p>
+      <w:pPr>
+        <w:spacing w:after="120" w:before="180"/>
+        <w:jc w:val="center"/>
+      </w:pPr>
+      <w:r>
+        <w:drawing>
+          <wp:inline distT="0" distB="0" distL="0" distR="0">
+            <wp:extent cx="4286250" cy="2476500"/>
+            <wp:effectExtent t="0" r="0" b="0" l="0"/>
+            <wp:docPr id="10" name="" descr="" title=""/>
+            <wp:cNvGraphicFramePr>
+              <a:graphicFrameLocks xmlns:a="http://schemas.openxmlformats.org/drawingml/2006/main" noChangeAspect="1"/>
+            </wp:cNvGraphicFramePr>
+            <a:graphic xmlns:a="http://schemas.openxmlformats.org/drawingml/2006/main">
+              <a:graphicData uri="http://schemas.openxmlformats.org/drawingml/2006/picture">
+                <pic:pic xmlns:pic="http://schemas.openxmlformats.org/drawingml/2006/picture">
+                  <pic:nvPicPr>
+                    <pic:cNvPr id="0" name="" descr=""/>
+                    <pic:cNvPicPr>
+                      <a:picLocks noChangeAspect="1" noChangeArrowheads="1"/>
+                    </pic:cNvPicPr>
+                  </pic:nvPicPr>
+                  <pic:blipFill>
+                    <a:blip r:embed="rId13" cstate="none"/>
+                    <a:srcRect/>
+                    <a:stretch>
+                      <a:fillRect/>
+                    </a:stretch>
+                  </pic:blipFill>
+                  <pic:spPr bwMode="auto">
+                    <a:xfrm>
+                      <a:off x="0" y="0"/>
+                      <a:ext cx="4286250" cy="2476500"/>
+                    </a:xfrm>
+                    <a:prstGeom prst="rect">
+                      <a:avLst/>
+                    </a:prstGeom>
+                  </pic:spPr>
+                </pic:pic>
+              </a:graphicData>
+            </a:graphic>
+          </wp:inline>
+        </w:drawing>
+      </w:r>
+    </w:p>
+    <w:p>
+      <w:pPr>
+        <w:spacing w:after="180" w:before="60"/>
+        <w:jc w:val="center"/>
+      </w:pPr>
+      <w:r>
+        <w:rPr>
+          <w:rFonts w:ascii="Cambria" w:cs="Cambria" w:eastAsia="Cambria" w:hAnsi="Cambria"/>
+          <w:b/>
+          <w:bCs/>
+          <w:color w:val="1E3A8A"/>
+          <w:sz w:val="22"/>
+          <w:szCs w:val="22"/>
+        </w:rPr>
+        <w:t xml:space="preserve">Figure 10.3: Final Output Screenshot 3 — Secure User Authentication &amp; Session Protection</w:t>
+      </w:r>
+    </w:p>
+    <w:p>
+      <w:pPr>
+        <w:spacing w:after="120" w:before="180"/>
+        <w:jc w:val="center"/>
+      </w:pPr>
+      <w:r>
+        <w:drawing>
+          <wp:inline distT="0" distB="0" distL="0" distR="0">
+            <wp:extent cx="4286250" cy="2476500"/>
+            <wp:effectExtent t="0" r="0" b="0" l="0"/>
+            <wp:docPr id="11" name="" descr="" title=""/>
+            <wp:cNvGraphicFramePr>
+              <a:graphicFrameLocks xmlns:a="http://schemas.openxmlformats.org/drawingml/2006/main" noChangeAspect="1"/>
+            </wp:cNvGraphicFramePr>
+            <a:graphic xmlns:a="http://schemas.openxmlformats.org/drawingml/2006/main">
+              <a:graphicData uri="http://schemas.openxmlformats.org/drawingml/2006/picture">
+                <pic:pic xmlns:pic="http://schemas.openxmlformats.org/drawingml/2006/picture">
+                  <pic:nvPicPr>
+                    <pic:cNvPr id="0" name="" descr=""/>
+                    <pic:cNvPicPr>
+                      <a:picLocks noChangeAspect="1" noChangeArrowheads="1"/>
+                    </pic:cNvPicPr>
+                  </pic:nvPicPr>
+                  <pic:blipFill>
+                    <a:blip r:embed="rId14" cstate="none"/>
+                    <a:srcRect/>
+                    <a:stretch>
+                      <a:fillRect/>
+                    </a:stretch>
+                  </pic:blipFill>
+                  <pic:spPr bwMode="auto">
+                    <a:xfrm>
+                      <a:off x="0" y="0"/>
+                      <a:ext cx="4286250" cy="2476500"/>
+                    </a:xfrm>
+                    <a:prstGeom prst="rect">
+                      <a:avLst/>
+                    </a:prstGeom>
+                  </pic:spPr>
+                </pic:pic>
+              </a:graphicData>
+            </a:graphic>
+          </wp:inline>
+        </w:drawing>
+      </w:r>
+    </w:p>
+    <w:p>
+      <w:pPr>
+        <w:spacing w:after="180" w:before="60"/>
+        <w:jc w:val="center"/>
+      </w:pPr>
+      <w:r>
+        <w:rPr>
+          <w:rFonts w:ascii="Cambria" w:cs="Cambria" w:eastAsia="Cambria" w:hAnsi="Cambria"/>
+          <w:b/>
+          <w:bCs/>
+          <w:color w:val="1E3A8A"/>
+          <w:sz w:val="22"/>
+          <w:szCs w:val="22"/>
+        </w:rPr>
+        <w:t xml:space="preserve">Figure 10.4: Final Output Screenshot 4 — Pre-built Templates Library &amp; Domain Categories</w:t>
+      </w:r>
+    </w:p>
+    <w:p>
+      <w:pPr>
+        <w:spacing w:after="120" w:before="180"/>
+        <w:jc w:val="center"/>
+      </w:pPr>
+      <w:r>
+        <w:drawing>
+          <wp:inline distT="0" distB="0" distL="0" distR="0">
+            <wp:extent cx="4286250" cy="2476500"/>
+            <wp:effectExtent t="0" r="0" b="0" l="0"/>
+            <wp:docPr id="12" name="" descr="" title=""/>
+            <wp:cNvGraphicFramePr>
+              <a:graphicFrameLocks xmlns:a="http://schemas.openxmlformats.org/drawingml/2006/main" noChangeAspect="1"/>
+            </wp:cNvGraphicFramePr>
+            <a:graphic xmlns:a="http://schemas.openxmlformats.org/drawingml/2006/main">
+              <a:graphicData uri="http://schemas.openxmlformats.org/drawingml/2006/picture">
+                <pic:pic xmlns:pic="http://schemas.openxmlformats.org/drawingml/2006/picture">
+                  <pic:nvPicPr>
+                    <pic:cNvPr id="0" name="" descr=""/>
+                    <pic:cNvPicPr>
+                      <a:picLocks noChangeAspect="1" noChangeArrowheads="1"/>
+                    </pic:cNvPicPr>
+                  </pic:nvPicPr>
+                  <pic:blipFill>
+                    <a:blip r:embed="rId15" cstate="none"/>
+                    <a:srcRect/>
+                    <a:stretch>
+                      <a:fillRect/>
+                    </a:stretch>
+                  </pic:blipFill>
+                  <pic:spPr bwMode="auto">
+                    <a:xfrm>
+                      <a:off x="0" y="0"/>
+                      <a:ext cx="4286250" cy="2476500"/>
+                    </a:xfrm>
+                    <a:prstGeom prst="rect">
+                      <a:avLst/>
+                    </a:prstGeom>
+                  </pic:spPr>
+                </pic:pic>
+              </a:graphicData>
+            </a:graphic>
+          </wp:inline>
+        </w:drawing>
+      </w:r>
+    </w:p>
+    <w:p>
+      <w:pPr>
+        <w:spacing w:after="180" w:before="60"/>
+        <w:jc w:val="center"/>
+      </w:pPr>
+      <w:r>
+        <w:rPr>
+          <w:rFonts w:ascii="Cambria" w:cs="Cambria" w:eastAsia="Cambria" w:hAnsi="Cambria"/>
+          <w:b/>
+          <w:bCs/>
+          <w:color w:val="1E3A8A"/>
+          <w:sz w:val="22"/>
+          <w:szCs w:val="22"/>
+        </w:rPr>
+        <w:t xml:space="preserve">Figure 10.5: Final Output Screenshot 5 — Tiered Subscription &amp; Plan Management</w:t>
+      </w:r>
+    </w:p>
     <w:p>
       <w:pPr>
         <w:pStyle w:val="Heading2"/>
@@ -32726,7 +33010,7 @@
                 <w:sz w:val="24"/>
                 <w:szCs w:val="24"/>
               </w:rPr>
-              <w:t xml:space="preserve">Shows terminal screenshot of qa_test_report.json execution showing 39 total passed tests with 0 failures.</w:t>
+              <w:t xml:space="preserve">Terminal output of qa_test_report.json showing 39 passed test suites with zero failures.</w:t>
             </w:r>
           </w:p>
         </w:tc>
@@ -32785,7 +33069,7 @@
                 <w:sz w:val="24"/>
                 <w:szCs w:val="24"/>
               </w:rPr>
-              <w:t xml:space="preserve">Shows database migration history and Prisma Studio model view.</w:t>
+              <w:t xml:space="preserve">Database migration status and model schema verification.</w:t>
             </w:r>
           </w:p>
         </w:tc>
@@ -32836,7 +33120,7 @@
                 <w:sz w:val="24"/>
                 <w:szCs w:val="24"/>
               </w:rPr>
-              <w:t xml:space="preserve">Figure A.3: Gemini REST Multimodal API Response: </w:t>
+              <w:t xml:space="preserve">Figure A.3: Gemini REST Multimodal API Response Payload: </w:t>
             </w:r>
             <w:r>
               <w:rPr>
@@ -32844,7 +33128,7 @@
                 <w:sz w:val="24"/>
                 <w:szCs w:val="24"/>
               </w:rPr>
-              <w:t xml:space="preserve">Shows raw JSON response returned by Google Gemini API for prompt generation.</w:t>
+              <w:t xml:space="preserve">Raw JSON payload returned by Google Gemini model.</w:t>
             </w:r>
           </w:p>
         </w:tc>
@@ -34566,7 +34850,7 @@
                 <w:sz w:val="20"/>
                 <w:szCs w:val="20"/>
               </w:rPr>
-              <w:t xml:space="preserve">Figures &amp; Diagrams Captioned</w:t>
+              <w:t xml:space="preserve">Figures &amp; Diagrams Captioned &amp; Embedded</w:t>
             </w:r>
           </w:p>
         </w:tc>

</xml_diff>